<commit_message>
Cloud demo (deploy/cloud, Render blueprint); GitHub download links in docs
</commit_message>
<xml_diff>
--- a/docs/OpenBedside-What-It-Is-v0.2.0.docx
+++ b/docs/OpenBedside-What-It-Is-v0.2.0.docx
@@ -1186,7 +1186,27 @@
           <w:sz w:val="20"/>
           <w:szCs w:val="20"/>
         </w:rPr>
-        <w:t xml:space="preserve">Put the OpenBedside folder anywhere, and follow START-HERE-install-on-your-Mac.md inside it. Linux is the same, and Windows is covered in the user guide.</w:t>
+        <w:t xml:space="preserve">Download OpenBedside from </w:t>
+      </w:r>
+      <w:r>
+        <w:rPr>
+          <w:rFonts w:ascii="Calibri" w:cs="Calibri" w:eastAsia="Calibri" w:hAnsi="Calibri"/>
+          <w:b/>
+          <w:bCs/>
+          <w:color w:val="243240"/>
+          <w:sz w:val="20"/>
+          <w:szCs w:val="20"/>
+        </w:rPr>
+        <w:t xml:space="preserve">github.com/danielpettus/openbedside</w:t>
+      </w:r>
+      <w:r>
+        <w:rPr>
+          <w:rFonts w:ascii="Calibri" w:cs="Calibri" w:eastAsia="Calibri" w:hAnsi="Calibri"/>
+          <w:color w:val="243240"/>
+          <w:sz w:val="20"/>
+          <w:szCs w:val="20"/>
+        </w:rPr>
+        <w:t xml:space="preserve"> (the kit is under Releases), and follow START-HERE-install-on-your-Mac.md inside it. Linux is the same, and Windows is covered in the user guide.</w:t>
       </w:r>
     </w:p>
     <w:p>
@@ -2770,7 +2790,7 @@
           <w:sz w:val="21"/>
           <w:szCs w:val="21"/>
         </w:rPr>
-        <w:t xml:space="preserve">Questions, problems and improvements: Daniel C. Pettus, through danielpettus.com.</w:t>
+        <w:t xml:space="preserve">Source, releases and issues: github.com/danielpettus/openbedside. Questions and improvements: Daniel C. Pettus, through danielpettus.com.</w:t>
       </w:r>
     </w:p>
     <w:sectPr>

</xml_diff>